<commit_message>
docs: especifica informações técnicas e fluxo geriátrico v1.3
</commit_message>
<xml_diff>
--- a/docs/projeto-saude-da-familia.docx
+++ b/docs/projeto-saude-da-familia.docx
@@ -20,7 +20,7 @@
     </w:p>
     <w:p>
       <w:r>
-        <w:t>Especificação funcional e técnica para engenharia de software | Versão 1.2 | 8 de outubro de 2026</w:t>
+        <w:t>Especificação funcional e técnica para engenharia de software | Versão 1.3 | 8 de outubro de 2026</w:t>
       </w:r>
     </w:p>
     <w:p>
@@ -6677,6 +6677,1714 @@
         <w:t>[14] van Walraven C et al. Derivation and validation of an index to predict early death or unplanned readmission after discharge from hospital to the community. CMAJ. 2010. https://pubmed.ncbi.nlm.nih.gov/20194559/</w:t>
       </w:r>
     </w:p>
+    <w:p>
+      <w:pPr>
+        <w:pStyle w:val="Heading1"/>
+        <w:pageBreakBefore/>
+      </w:pPr>
+      <w:r>
+        <w:t>14 Informações técnicas no relatório final</w:t>
+      </w:r>
+    </w:p>
+    <w:p>
+      <w:r>
+        <w:t>Adicionar o botão “Informações técnicas” ao relatório final do Projeto Saúde da Família. Ao clicar, o médico abre orientações profissionais baseadas nos seis domínios de rastreio da consulta e no fluxo de cuidado compartilhado com o geriatra do programa. A regra central é: qualquer domínio alterado exige discussão do caso, mesmo quando a equipe de família já iniciou a conduta.</w:t>
+      </w:r>
+    </w:p>
+    <w:p>
+      <w:pPr>
+        <w:pStyle w:val="Heading2"/>
+      </w:pPr>
+      <w:r>
+        <w:t>Interação e organização do painel</w:t>
+      </w:r>
+    </w:p>
+    <w:p>
+      <w:r>
+        <w:t>Exibir o botão em posição visível próxima à tabela de resultados. Abrir uma seção expansível, sem sair do paciente ou perder a posição de leitura. Identificar paciente, consulta e data; manter os resultados e a versão de cada instrumento visíveis. Navegação por teclado, foco e estado expandido/recolhido devem ser acessíveis.</w:t>
+      </w:r>
+    </w:p>
+    <w:p>
+      <w:r>
+        <w:t>Organizar o conteúdo em quatro partes: rastreio inicial; interpretação e conduta por domínio; discussão com o geriatra; plano compartilhado e reavaliação. A primeira informação será a síntese de domínios com alteração, incompletos e sem alteração registrada, seguida da recomendação de percurso.</w:t>
+      </w:r>
+    </w:p>
+    <w:p>
+      <w:pPr>
+        <w:pStyle w:val="Heading2"/>
+      </w:pPr>
+      <w:r>
+        <w:t>Público e revisão clínica</w:t>
+      </w:r>
+    </w:p>
+    <w:p>
+      <w:r>
+        <w:t>O painel utiliza linguagem técnica para o médico de família e constitui apoio à decisão. Cada conduta derivada é uma sugestão até confirmação médica. Não converter a abertura do painel ou a finalização da consulta em confirmação automática de encaminhamento, prescrição ou discussão com o geriatra.</w:t>
+      </w:r>
+    </w:p>
+    <w:p>
+      <w:r>
+        <w:t>No relatório da família, manter orientações acessíveis e condutas confirmadas; não inserir automaticamente a discussão técnica. Permitir incluir o apêndice profissional na impressão/exportação por escolha explícita e após revisão. A tabela de resultados previamente aprovada permanece preservada.</w:t>
+      </w:r>
+    </w:p>
+    <w:p>
+      <w:pPr>
+        <w:pStyle w:val="Heading2"/>
+      </w:pPr>
+      <w:r>
+        <w:t>Rastreio inicial e periodicidade</w:t>
+      </w:r>
+    </w:p>
+    <w:p>
+      <w:r>
+        <w:t>Aplicar os seis domínios na consulta índice ou no exame periódico da pessoa idosa; repetir anualmente quando não houver alterações e antecipar conforme sintomas, eventos e necessidade clínica. Instrumentos de autorrelato e testes administrados pelo profissional terão instruções próprias; não tratar 10-CS ou teste motor como autoaplicáveis.</w:t>
+      </w:r>
+    </w:p>
+    <w:p>
+      <w:r>
+        <w:t>GDS-5 permanece o padrão aprovado. GDS-15 pode ser usada como alternativa identificada, sem exigir ambas na mesma consulta. MNA-SF permanece o rastreio nutricional principal; perda de peso involuntária &gt;3 kg em três meses funciona como alerta independente, sem converter-se em escore MNA-SF. A informação ausente deve permanecer desconhecida.</w:t>
+      </w:r>
+    </w:p>
+    <w:p>
+      <w:pPr>
+        <w:pStyle w:val="Heading2"/>
+      </w:pPr>
+      <w:r>
+        <w:t>Contratos atualizados</w:t>
+      </w:r>
+    </w:p>
+    <w:p>
+      <w:r>
+        <w:t>Os limiares descritos na seção seguinte passam a integrar o protocolo do programa. Congelar a versão, redação e ajustes por escolaridade do 10-CS e a tradução da GDS antes de codificar. Não alterar classificações históricas ou de outros módulos quando o protocolo do programa tiver um limiar distinto.</w:t>
+      </w:r>
+    </w:p>
+    <w:p>
+      <w:pPr>
+        <w:pStyle w:val="Heading1"/>
+        <w:pageBreakBefore/>
+      </w:pPr>
+      <w:r>
+        <w:t>15 Orientações técnicas por domínio</w:t>
+      </w:r>
+    </w:p>
+    <w:p>
+      <w:r>
+        <w:t>Exibir a orientação específica quando o critério estiver presente na consulta atual. Mostrar o achado que ativou a orientação e sua data. Uma alteração isolada recebe conduta inicial e discussão com o geriatra; a ausência de resultado válido não recebe orientação de normalidade.</w:t>
+      </w:r>
+    </w:p>
+    <w:tbl>
+      <w:tblPr>
+        <w:tblW w:type="auto" w:w="0"/>
+        <w:tblLayout w:type="fixed"/>
+        <w:tblLook w:firstColumn="1" w:firstRow="1" w:lastColumn="0" w:lastRow="0" w:noHBand="0" w:noVBand="1" w:val="04A0"/>
+      </w:tblPr>
+      <w:tblGrid>
+        <w:gridCol w:w="1512"/>
+        <w:gridCol w:w="3024"/>
+        <w:gridCol w:w="5544"/>
+      </w:tblGrid>
+      <w:tr>
+        <w:trPr>
+          <w:cantSplit/>
+          <w:tblHeader/>
+        </w:trPr>
+        <w:tc>
+          <w:tcPr>
+            <w:tcW w:type="dxa" w:w="1512"/>
+            <w:vAlign w:val="center"/>
+            <w:shd w:fill="E7EFF2"/>
+            <w:tcBorders>
+              <w:top w:val="single" w:color="D9D9D9" w:sz="4"/>
+              <w:left w:val="single" w:color="D9D9D9" w:sz="4"/>
+              <w:bottom w:val="single" w:color="D9D9D9" w:sz="4"/>
+              <w:right w:val="single" w:color="D9D9D9" w:sz="4"/>
+            </w:tcBorders>
+            <w:tcMar>
+              <w:top w:w="95" w:type="dxa"/>
+              <w:left w:w="95" w:type="dxa"/>
+              <w:bottom w:w="95" w:type="dxa"/>
+              <w:right w:w="95" w:type="dxa"/>
+            </w:tcMar>
+          </w:tcPr>
+          <w:p>
+            <w:pPr>
+              <w:spacing w:after="40" w:before="40" w:line="247" w:lineRule="auto"/>
+            </w:pPr>
+            <w:r>
+              <w:rPr>
+                <w:b/>
+                <w:sz w:val="19"/>
+              </w:rPr>
+              <w:t>Domínio</w:t>
+            </w:r>
+          </w:p>
+        </w:tc>
+        <w:tc>
+          <w:tcPr>
+            <w:tcW w:type="dxa" w:w="3024"/>
+            <w:vAlign w:val="center"/>
+            <w:shd w:fill="E7EFF2"/>
+            <w:tcBorders>
+              <w:top w:val="single" w:color="D9D9D9" w:sz="4"/>
+              <w:left w:val="single" w:color="D9D9D9" w:sz="4"/>
+              <w:bottom w:val="single" w:color="D9D9D9" w:sz="4"/>
+              <w:right w:val="single" w:color="D9D9D9" w:sz="4"/>
+            </w:tcBorders>
+            <w:tcMar>
+              <w:top w:w="95" w:type="dxa"/>
+              <w:left w:w="95" w:type="dxa"/>
+              <w:bottom w:w="95" w:type="dxa"/>
+              <w:right w:w="95" w:type="dxa"/>
+            </w:tcMar>
+          </w:tcPr>
+          <w:p>
+            <w:pPr>
+              <w:spacing w:after="40" w:before="40" w:line="247" w:lineRule="auto"/>
+            </w:pPr>
+            <w:r>
+              <w:rPr>
+                <w:b/>
+                <w:sz w:val="19"/>
+              </w:rPr>
+              <w:t>Critério do programa</w:t>
+            </w:r>
+          </w:p>
+        </w:tc>
+        <w:tc>
+          <w:tcPr>
+            <w:tcW w:type="dxa" w:w="5544"/>
+            <w:vAlign w:val="center"/>
+            <w:shd w:fill="E7EFF2"/>
+            <w:tcBorders>
+              <w:top w:val="single" w:color="D9D9D9" w:sz="4"/>
+              <w:left w:val="single" w:color="D9D9D9" w:sz="4"/>
+              <w:bottom w:val="single" w:color="D9D9D9" w:sz="4"/>
+              <w:right w:val="single" w:color="D9D9D9" w:sz="4"/>
+            </w:tcBorders>
+            <w:tcMar>
+              <w:top w:w="95" w:type="dxa"/>
+              <w:left w:w="95" w:type="dxa"/>
+              <w:bottom w:w="95" w:type="dxa"/>
+              <w:right w:w="95" w:type="dxa"/>
+            </w:tcMar>
+          </w:tcPr>
+          <w:p>
+            <w:pPr>
+              <w:spacing w:after="40" w:before="40" w:line="247" w:lineRule="auto"/>
+            </w:pPr>
+            <w:r>
+              <w:rPr>
+                <w:b/>
+                <w:sz w:val="19"/>
+              </w:rPr>
+              <w:t>Orientação ao médico de família</w:t>
+            </w:r>
+          </w:p>
+        </w:tc>
+      </w:tr>
+      <w:tr>
+        <w:trPr>
+          <w:cantSplit/>
+        </w:trPr>
+        <w:tc>
+          <w:tcPr>
+            <w:tcW w:type="dxa" w:w="1512"/>
+            <w:vAlign w:val="center"/>
+            <w:shd w:fill="FFFFFF"/>
+            <w:tcBorders>
+              <w:top w:val="single" w:color="D9D9D9" w:sz="4"/>
+              <w:left w:val="single" w:color="D9D9D9" w:sz="4"/>
+              <w:bottom w:val="single" w:color="D9D9D9" w:sz="4"/>
+              <w:right w:val="single" w:color="D9D9D9" w:sz="4"/>
+            </w:tcBorders>
+            <w:tcMar>
+              <w:top w:w="95" w:type="dxa"/>
+              <w:left w:w="95" w:type="dxa"/>
+              <w:bottom w:w="95" w:type="dxa"/>
+              <w:right w:w="95" w:type="dxa"/>
+            </w:tcMar>
+          </w:tcPr>
+          <w:p>
+            <w:pPr>
+              <w:spacing w:after="40" w:before="40" w:line="247" w:lineRule="auto"/>
+            </w:pPr>
+            <w:r>
+              <w:rPr>
+                <w:b w:val="0"/>
+                <w:sz w:val="19"/>
+              </w:rPr>
+              <w:t>Funcionalidade</w:t>
+            </w:r>
+          </w:p>
+        </w:tc>
+        <w:tc>
+          <w:tcPr>
+            <w:tcW w:type="dxa" w:w="3024"/>
+            <w:vAlign w:val="center"/>
+            <w:shd w:fill="FFFFFF"/>
+            <w:tcBorders>
+              <w:top w:val="single" w:color="D9D9D9" w:sz="4"/>
+              <w:left w:val="single" w:color="D9D9D9" w:sz="4"/>
+              <w:bottom w:val="single" w:color="D9D9D9" w:sz="4"/>
+              <w:right w:val="single" w:color="D9D9D9" w:sz="4"/>
+            </w:tcBorders>
+            <w:tcMar>
+              <w:top w:w="95" w:type="dxa"/>
+              <w:left w:w="95" w:type="dxa"/>
+              <w:bottom w:w="95" w:type="dxa"/>
+              <w:right w:w="95" w:type="dxa"/>
+            </w:tcMar>
+          </w:tcPr>
+          <w:p>
+            <w:pPr>
+              <w:spacing w:after="40" w:before="40" w:line="247" w:lineRule="auto"/>
+            </w:pPr>
+            <w:r>
+              <w:rPr>
+                <w:b w:val="0"/>
+                <w:sz w:val="19"/>
+              </w:rPr>
+              <w:t>Katz ou Lawton: qualquer item com necessidade de ajuda ou incapacidade.</w:t>
+            </w:r>
+          </w:p>
+        </w:tc>
+        <w:tc>
+          <w:tcPr>
+            <w:tcW w:type="dxa" w:w="5544"/>
+            <w:vAlign w:val="center"/>
+            <w:shd w:fill="FFFFFF"/>
+            <w:tcBorders>
+              <w:top w:val="single" w:color="D9D9D9" w:sz="4"/>
+              <w:left w:val="single" w:color="D9D9D9" w:sz="4"/>
+              <w:bottom w:val="single" w:color="D9D9D9" w:sz="4"/>
+              <w:right w:val="single" w:color="D9D9D9" w:sz="4"/>
+            </w:tcBorders>
+            <w:tcMar>
+              <w:top w:w="95" w:type="dxa"/>
+              <w:left w:w="95" w:type="dxa"/>
+              <w:bottom w:w="95" w:type="dxa"/>
+              <w:right w:w="95" w:type="dxa"/>
+            </w:tcMar>
+          </w:tcPr>
+          <w:p>
+            <w:pPr>
+              <w:spacing w:after="40" w:before="40" w:line="247" w:lineRule="auto"/>
+            </w:pPr>
+            <w:r>
+              <w:rPr>
+                <w:b w:val="0"/>
+                <w:sz w:val="19"/>
+              </w:rPr>
+              <w:t>Investigar doença aguda, dor, déficit sensorial e medicamentos. Registrar início e evolução da perda. Encaminhar para terapia ocupacional/fisioterapia conforme necessidade. Declínio agudo ou progressivo prioriza avaliação geriátrica ampla.</w:t>
+            </w:r>
+          </w:p>
+        </w:tc>
+      </w:tr>
+      <w:tr>
+        <w:trPr>
+          <w:cantSplit/>
+        </w:trPr>
+        <w:tc>
+          <w:tcPr>
+            <w:tcW w:type="dxa" w:w="1512"/>
+            <w:vAlign w:val="center"/>
+            <w:shd w:fill="FFFFFF"/>
+            <w:tcBorders>
+              <w:top w:val="single" w:color="D9D9D9" w:sz="4"/>
+              <w:left w:val="single" w:color="D9D9D9" w:sz="4"/>
+              <w:bottom w:val="single" w:color="D9D9D9" w:sz="4"/>
+              <w:right w:val="single" w:color="D9D9D9" w:sz="4"/>
+            </w:tcBorders>
+            <w:tcMar>
+              <w:top w:w="95" w:type="dxa"/>
+              <w:left w:w="95" w:type="dxa"/>
+              <w:bottom w:w="95" w:type="dxa"/>
+              <w:right w:w="95" w:type="dxa"/>
+            </w:tcMar>
+          </w:tcPr>
+          <w:p>
+            <w:pPr>
+              <w:spacing w:after="40" w:before="40" w:line="247" w:lineRule="auto"/>
+            </w:pPr>
+            <w:r>
+              <w:rPr>
+                <w:b w:val="0"/>
+                <w:sz w:val="19"/>
+              </w:rPr>
+              <w:t>Locomoção</w:t>
+            </w:r>
+          </w:p>
+        </w:tc>
+        <w:tc>
+          <w:tcPr>
+            <w:tcW w:type="dxa" w:w="3024"/>
+            <w:vAlign w:val="center"/>
+            <w:shd w:fill="FFFFFF"/>
+            <w:tcBorders>
+              <w:top w:val="single" w:color="D9D9D9" w:sz="4"/>
+              <w:left w:val="single" w:color="D9D9D9" w:sz="4"/>
+              <w:bottom w:val="single" w:color="D9D9D9" w:sz="4"/>
+              <w:right w:val="single" w:color="D9D9D9" w:sz="4"/>
+            </w:tcBorders>
+            <w:tcMar>
+              <w:top w:w="95" w:type="dxa"/>
+              <w:left w:w="95" w:type="dxa"/>
+              <w:bottom w:w="95" w:type="dxa"/>
+              <w:right w:w="95" w:type="dxa"/>
+            </w:tcMar>
+          </w:tcPr>
+          <w:p>
+            <w:pPr>
+              <w:spacing w:after="40" w:before="40" w:line="247" w:lineRule="auto"/>
+            </w:pPr>
+            <w:r>
+              <w:rPr>
+                <w:b w:val="0"/>
+                <w:sz w:val="19"/>
+              </w:rPr>
+              <w:t>5xSTS &gt;15 s, dispositivo de marcha ou queda no último ano.</w:t>
+            </w:r>
+          </w:p>
+        </w:tc>
+        <w:tc>
+          <w:tcPr>
+            <w:tcW w:type="dxa" w:w="5544"/>
+            <w:vAlign w:val="center"/>
+            <w:shd w:fill="FFFFFF"/>
+            <w:tcBorders>
+              <w:top w:val="single" w:color="D9D9D9" w:sz="4"/>
+              <w:left w:val="single" w:color="D9D9D9" w:sz="4"/>
+              <w:bottom w:val="single" w:color="D9D9D9" w:sz="4"/>
+              <w:right w:val="single" w:color="D9D9D9" w:sz="4"/>
+            </w:tcBorders>
+            <w:tcMar>
+              <w:top w:w="95" w:type="dxa"/>
+              <w:left w:w="95" w:type="dxa"/>
+              <w:bottom w:w="95" w:type="dxa"/>
+              <w:right w:w="95" w:type="dxa"/>
+            </w:tcMar>
+          </w:tcPr>
+          <w:p>
+            <w:pPr>
+              <w:spacing w:after="40" w:before="40" w:line="247" w:lineRule="auto"/>
+            </w:pPr>
+            <w:r>
+              <w:rPr>
+                <w:b w:val="0"/>
+                <w:sz w:val="19"/>
+              </w:rPr>
+              <w:t>Rever medicamentos pelo STOPPFall, visão, calçados e ambiente domiciliar. Avaliar marcha/equilíbrio e encaminhar à fisioterapia para treino e fortalecimento. O tempo sinaliza baixa força; não mede equilíbrio isoladamente. [5,12–13,15]</w:t>
+            </w:r>
+          </w:p>
+        </w:tc>
+      </w:tr>
+      <w:tr>
+        <w:trPr>
+          <w:cantSplit/>
+        </w:trPr>
+        <w:tc>
+          <w:tcPr>
+            <w:tcW w:type="dxa" w:w="1512"/>
+            <w:vAlign w:val="center"/>
+            <w:shd w:fill="FFFFFF"/>
+            <w:tcBorders>
+              <w:top w:val="single" w:color="D9D9D9" w:sz="4"/>
+              <w:left w:val="single" w:color="D9D9D9" w:sz="4"/>
+              <w:bottom w:val="single" w:color="D9D9D9" w:sz="4"/>
+              <w:right w:val="single" w:color="D9D9D9" w:sz="4"/>
+            </w:tcBorders>
+            <w:tcMar>
+              <w:top w:w="95" w:type="dxa"/>
+              <w:left w:w="95" w:type="dxa"/>
+              <w:bottom w:w="95" w:type="dxa"/>
+              <w:right w:w="95" w:type="dxa"/>
+            </w:tcMar>
+          </w:tcPr>
+          <w:p>
+            <w:pPr>
+              <w:spacing w:after="40" w:before="40" w:line="247" w:lineRule="auto"/>
+            </w:pPr>
+            <w:r>
+              <w:rPr>
+                <w:b w:val="0"/>
+                <w:sz w:val="19"/>
+              </w:rPr>
+              <w:t>Humor</w:t>
+            </w:r>
+          </w:p>
+        </w:tc>
+        <w:tc>
+          <w:tcPr>
+            <w:tcW w:type="dxa" w:w="3024"/>
+            <w:vAlign w:val="center"/>
+            <w:shd w:fill="FFFFFF"/>
+            <w:tcBorders>
+              <w:top w:val="single" w:color="D9D9D9" w:sz="4"/>
+              <w:left w:val="single" w:color="D9D9D9" w:sz="4"/>
+              <w:bottom w:val="single" w:color="D9D9D9" w:sz="4"/>
+              <w:right w:val="single" w:color="D9D9D9" w:sz="4"/>
+            </w:tcBorders>
+            <w:tcMar>
+              <w:top w:w="95" w:type="dxa"/>
+              <w:left w:w="95" w:type="dxa"/>
+              <w:bottom w:w="95" w:type="dxa"/>
+              <w:right w:w="95" w:type="dxa"/>
+            </w:tcMar>
+          </w:tcPr>
+          <w:p>
+            <w:pPr>
+              <w:spacing w:after="40" w:before="40" w:line="247" w:lineRule="auto"/>
+            </w:pPr>
+            <w:r>
+              <w:rPr>
+                <w:b w:val="0"/>
+                <w:sz w:val="19"/>
+              </w:rPr>
+              <w:t>GDS-5 ≥2; se utilizada GDS-15, ≥5.</w:t>
+            </w:r>
+          </w:p>
+        </w:tc>
+        <w:tc>
+          <w:tcPr>
+            <w:tcW w:type="dxa" w:w="5544"/>
+            <w:vAlign w:val="center"/>
+            <w:shd w:fill="FFFFFF"/>
+            <w:tcBorders>
+              <w:top w:val="single" w:color="D9D9D9" w:sz="4"/>
+              <w:left w:val="single" w:color="D9D9D9" w:sz="4"/>
+              <w:bottom w:val="single" w:color="D9D9D9" w:sz="4"/>
+              <w:right w:val="single" w:color="D9D9D9" w:sz="4"/>
+            </w:tcBorders>
+            <w:tcMar>
+              <w:top w:w="95" w:type="dxa"/>
+              <w:left w:w="95" w:type="dxa"/>
+              <w:bottom w:w="95" w:type="dxa"/>
+              <w:right w:w="95" w:type="dxa"/>
+            </w:tcMar>
+          </w:tcPr>
+          <w:p>
+            <w:pPr>
+              <w:spacing w:after="40" w:before="40" w:line="247" w:lineRule="auto"/>
+            </w:pPr>
+            <w:r>
+              <w:rPr>
+                <w:b w:val="0"/>
+                <w:sz w:val="19"/>
+              </w:rPr>
+              <w:t>Aprofundar avaliação de depressão, ideação suicida e álcool. Manejo pela equipe de família conforme avaliação clínica. GDS-15 ≥10 pede avaliação prioritária da intensidade e repercussão. Sintomas graves, risco de suicídio ou falha terapêutica indicam saúde mental/psiquiatria. [4,16]</w:t>
+            </w:r>
+          </w:p>
+        </w:tc>
+      </w:tr>
+      <w:tr>
+        <w:trPr>
+          <w:cantSplit/>
+        </w:trPr>
+        <w:tc>
+          <w:tcPr>
+            <w:tcW w:type="dxa" w:w="1512"/>
+            <w:vAlign w:val="center"/>
+            <w:shd w:fill="FFFFFF"/>
+            <w:tcBorders>
+              <w:top w:val="single" w:color="D9D9D9" w:sz="4"/>
+              <w:left w:val="single" w:color="D9D9D9" w:sz="4"/>
+              <w:bottom w:val="single" w:color="D9D9D9" w:sz="4"/>
+              <w:right w:val="single" w:color="D9D9D9" w:sz="4"/>
+            </w:tcBorders>
+            <w:tcMar>
+              <w:top w:w="95" w:type="dxa"/>
+              <w:left w:w="95" w:type="dxa"/>
+              <w:bottom w:w="95" w:type="dxa"/>
+              <w:right w:w="95" w:type="dxa"/>
+            </w:tcMar>
+          </w:tcPr>
+          <w:p>
+            <w:pPr>
+              <w:spacing w:after="40" w:before="40" w:line="247" w:lineRule="auto"/>
+            </w:pPr>
+            <w:r>
+              <w:rPr>
+                <w:b w:val="0"/>
+                <w:sz w:val="19"/>
+              </w:rPr>
+              <w:t>Cognição</w:t>
+            </w:r>
+          </w:p>
+        </w:tc>
+        <w:tc>
+          <w:tcPr>
+            <w:tcW w:type="dxa" w:w="3024"/>
+            <w:vAlign w:val="center"/>
+            <w:shd w:fill="FFFFFF"/>
+            <w:tcBorders>
+              <w:top w:val="single" w:color="D9D9D9" w:sz="4"/>
+              <w:left w:val="single" w:color="D9D9D9" w:sz="4"/>
+              <w:bottom w:val="single" w:color="D9D9D9" w:sz="4"/>
+              <w:right w:val="single" w:color="D9D9D9" w:sz="4"/>
+            </w:tcBorders>
+            <w:tcMar>
+              <w:top w:w="95" w:type="dxa"/>
+              <w:left w:w="95" w:type="dxa"/>
+              <w:bottom w:w="95" w:type="dxa"/>
+              <w:right w:w="95" w:type="dxa"/>
+            </w:tcMar>
+          </w:tcPr>
+          <w:p>
+            <w:pPr>
+              <w:spacing w:after="40" w:before="40" w:line="247" w:lineRule="auto"/>
+            </w:pPr>
+            <w:r>
+              <w:rPr>
+                <w:b w:val="0"/>
+                <w:sz w:val="19"/>
+              </w:rPr>
+              <w:t>10-CS ≤7: 6–7 possível comprometimento; ≤5 provável comprometimento.</w:t>
+            </w:r>
+          </w:p>
+        </w:tc>
+        <w:tc>
+          <w:tcPr>
+            <w:tcW w:type="dxa" w:w="5544"/>
+            <w:vAlign w:val="center"/>
+            <w:shd w:fill="FFFFFF"/>
+            <w:tcBorders>
+              <w:top w:val="single" w:color="D9D9D9" w:sz="4"/>
+              <w:left w:val="single" w:color="D9D9D9" w:sz="4"/>
+              <w:bottom w:val="single" w:color="D9D9D9" w:sz="4"/>
+              <w:right w:val="single" w:color="D9D9D9" w:sz="4"/>
+            </w:tcBorders>
+            <w:tcMar>
+              <w:top w:w="95" w:type="dxa"/>
+              <w:left w:w="95" w:type="dxa"/>
+              <w:bottom w:w="95" w:type="dxa"/>
+              <w:right w:w="95" w:type="dxa"/>
+            </w:tcMar>
+          </w:tcPr>
+          <w:p>
+            <w:pPr>
+              <w:spacing w:after="40" w:before="40" w:line="247" w:lineRule="auto"/>
+            </w:pPr>
+            <w:r>
+              <w:rPr>
+                <w:b w:val="0"/>
+                <w:sz w:val="19"/>
+              </w:rPr>
+              <w:t>Aplicar MEEM e integrar história, funcionalidade e relato familiar. Investigar delirium, depressão, medicamentos, hipotireoidismo e deficiência de B12 conforme contexto. ≥8 é rastreio sem alteração pelo corte, sem excluir suspeita persistente. Demência diagnosticada segue FAST. [1]</w:t>
+            </w:r>
+          </w:p>
+        </w:tc>
+      </w:tr>
+      <w:tr>
+        <w:trPr>
+          <w:cantSplit/>
+        </w:trPr>
+        <w:tc>
+          <w:tcPr>
+            <w:tcW w:type="dxa" w:w="1512"/>
+            <w:vAlign w:val="center"/>
+            <w:shd w:fill="FFFFFF"/>
+            <w:tcBorders>
+              <w:top w:val="single" w:color="D9D9D9" w:sz="4"/>
+              <w:left w:val="single" w:color="D9D9D9" w:sz="4"/>
+              <w:bottom w:val="single" w:color="D9D9D9" w:sz="4"/>
+              <w:right w:val="single" w:color="D9D9D9" w:sz="4"/>
+            </w:tcBorders>
+            <w:tcMar>
+              <w:top w:w="95" w:type="dxa"/>
+              <w:left w:w="95" w:type="dxa"/>
+              <w:bottom w:w="95" w:type="dxa"/>
+              <w:right w:w="95" w:type="dxa"/>
+            </w:tcMar>
+          </w:tcPr>
+          <w:p>
+            <w:pPr>
+              <w:spacing w:after="40" w:before="40" w:line="247" w:lineRule="auto"/>
+            </w:pPr>
+            <w:r>
+              <w:rPr>
+                <w:b w:val="0"/>
+                <w:sz w:val="19"/>
+              </w:rPr>
+              <w:t>Fragilidade</w:t>
+            </w:r>
+          </w:p>
+        </w:tc>
+        <w:tc>
+          <w:tcPr>
+            <w:tcW w:type="dxa" w:w="3024"/>
+            <w:vAlign w:val="center"/>
+            <w:shd w:fill="FFFFFF"/>
+            <w:tcBorders>
+              <w:top w:val="single" w:color="D9D9D9" w:sz="4"/>
+              <w:left w:val="single" w:color="D9D9D9" w:sz="4"/>
+              <w:bottom w:val="single" w:color="D9D9D9" w:sz="4"/>
+              <w:right w:val="single" w:color="D9D9D9" w:sz="4"/>
+            </w:tcBorders>
+            <w:tcMar>
+              <w:top w:w="95" w:type="dxa"/>
+              <w:left w:w="95" w:type="dxa"/>
+              <w:bottom w:w="95" w:type="dxa"/>
+              <w:right w:w="95" w:type="dxa"/>
+            </w:tcMar>
+          </w:tcPr>
+          <w:p>
+            <w:pPr>
+              <w:spacing w:after="40" w:before="40" w:line="247" w:lineRule="auto"/>
+            </w:pPr>
+            <w:r>
+              <w:rPr>
+                <w:b w:val="0"/>
+                <w:sz w:val="19"/>
+              </w:rPr>
+              <w:t>FRAIL 1–2: pré-fragilidade; ≥3: fragilidade.</w:t>
+            </w:r>
+          </w:p>
+        </w:tc>
+        <w:tc>
+          <w:tcPr>
+            <w:tcW w:type="dxa" w:w="5544"/>
+            <w:vAlign w:val="center"/>
+            <w:shd w:fill="FFFFFF"/>
+            <w:tcBorders>
+              <w:top w:val="single" w:color="D9D9D9" w:sz="4"/>
+              <w:left w:val="single" w:color="D9D9D9" w:sz="4"/>
+              <w:bottom w:val="single" w:color="D9D9D9" w:sz="4"/>
+              <w:right w:val="single" w:color="D9D9D9" w:sz="4"/>
+            </w:tcBorders>
+            <w:tcMar>
+              <w:top w:w="95" w:type="dxa"/>
+              <w:left w:w="95" w:type="dxa"/>
+              <w:bottom w:w="95" w:type="dxa"/>
+              <w:right w:w="95" w:type="dxa"/>
+            </w:tcMar>
+          </w:tcPr>
+          <w:p>
+            <w:pPr>
+              <w:spacing w:after="40" w:before="40" w:line="247" w:lineRule="auto"/>
+            </w:pPr>
+            <w:r>
+              <w:rPr>
+                <w:b w:val="0"/>
+                <w:sz w:val="19"/>
+              </w:rPr>
+              <w:t>Rever polifarmácia e otimizar exercício e nutrição. Pré-fragilidade também conta como domínio alterado e exige discussão do caso; prever revisão específica em 6–12 meses. FRAIL ≥3 prioriza avaliação geriátrica ampla. [7]</w:t>
+            </w:r>
+          </w:p>
+        </w:tc>
+      </w:tr>
+      <w:tr>
+        <w:trPr>
+          <w:cantSplit/>
+        </w:trPr>
+        <w:tc>
+          <w:tcPr>
+            <w:tcW w:type="dxa" w:w="1512"/>
+            <w:vAlign w:val="center"/>
+            <w:shd w:fill="FFFFFF"/>
+            <w:tcBorders>
+              <w:top w:val="single" w:color="D9D9D9" w:sz="4"/>
+              <w:left w:val="single" w:color="D9D9D9" w:sz="4"/>
+              <w:bottom w:val="single" w:color="D9D9D9" w:sz="4"/>
+              <w:right w:val="single" w:color="D9D9D9" w:sz="4"/>
+            </w:tcBorders>
+            <w:tcMar>
+              <w:top w:w="95" w:type="dxa"/>
+              <w:left w:w="95" w:type="dxa"/>
+              <w:bottom w:w="95" w:type="dxa"/>
+              <w:right w:w="95" w:type="dxa"/>
+            </w:tcMar>
+          </w:tcPr>
+          <w:p>
+            <w:pPr>
+              <w:spacing w:after="40" w:before="40" w:line="247" w:lineRule="auto"/>
+            </w:pPr>
+            <w:r>
+              <w:rPr>
+                <w:b w:val="0"/>
+                <w:sz w:val="19"/>
+              </w:rPr>
+              <w:t>Nutrição</w:t>
+            </w:r>
+          </w:p>
+        </w:tc>
+        <w:tc>
+          <w:tcPr>
+            <w:tcW w:type="dxa" w:w="3024"/>
+            <w:vAlign w:val="center"/>
+            <w:shd w:fill="FFFFFF"/>
+            <w:tcBorders>
+              <w:top w:val="single" w:color="D9D9D9" w:sz="4"/>
+              <w:left w:val="single" w:color="D9D9D9" w:sz="4"/>
+              <w:bottom w:val="single" w:color="D9D9D9" w:sz="4"/>
+              <w:right w:val="single" w:color="D9D9D9" w:sz="4"/>
+            </w:tcBorders>
+            <w:tcMar>
+              <w:top w:w="95" w:type="dxa"/>
+              <w:left w:w="95" w:type="dxa"/>
+              <w:bottom w:w="95" w:type="dxa"/>
+              <w:right w:w="95" w:type="dxa"/>
+            </w:tcMar>
+          </w:tcPr>
+          <w:p>
+            <w:pPr>
+              <w:spacing w:after="40" w:before="40" w:line="247" w:lineRule="auto"/>
+            </w:pPr>
+            <w:r>
+              <w:rPr>
+                <w:b w:val="0"/>
+                <w:sz w:val="19"/>
+              </w:rPr>
+              <w:t>MNA-SF ≤11 ou perda involuntária &gt;3 kg em três meses.</w:t>
+            </w:r>
+          </w:p>
+        </w:tc>
+        <w:tc>
+          <w:tcPr>
+            <w:tcW w:type="dxa" w:w="5544"/>
+            <w:vAlign w:val="center"/>
+            <w:shd w:fill="FFFFFF"/>
+            <w:tcBorders>
+              <w:top w:val="single" w:color="D9D9D9" w:sz="4"/>
+              <w:left w:val="single" w:color="D9D9D9" w:sz="4"/>
+              <w:bottom w:val="single" w:color="D9D9D9" w:sz="4"/>
+              <w:right w:val="single" w:color="D9D9D9" w:sz="4"/>
+            </w:tcBorders>
+            <w:tcMar>
+              <w:top w:w="95" w:type="dxa"/>
+              <w:left w:w="95" w:type="dxa"/>
+              <w:bottom w:w="95" w:type="dxa"/>
+              <w:right w:w="95" w:type="dxa"/>
+            </w:tcMar>
+          </w:tcPr>
+          <w:p>
+            <w:pPr>
+              <w:spacing w:after="40" w:before="40" w:line="247" w:lineRule="auto"/>
+            </w:pPr>
+            <w:r>
+              <w:rPr>
+                <w:b w:val="0"/>
+                <w:sz w:val="19"/>
+              </w:rPr>
+              <w:t>MNA-SF 8–11: risco; 0–7: desnutrição. Encaminhar à nutrição/dietética e investigar disfagia, condições odontológicas, depressão, isolamento e acesso à alimentação. Queixa de disfagia abre EAT-10. [8–9]</w:t>
+            </w:r>
+          </w:p>
+        </w:tc>
+      </w:tr>
+    </w:tbl>
+    <w:p/>
+    <w:p>
+      <w:pPr>
+        <w:pStyle w:val="Heading2"/>
+      </w:pPr>
+      <w:r>
+        <w:t>Interpretação clínica</w:t>
+      </w:r>
+    </w:p>
+    <w:p>
+      <w:r>
+        <w:t>GDS positiva não estabelece diagnóstico ou gravidade de depressão. O corte ≥5 da GDS-15 tem apoio em validação brasileira na atenção primária; outras versões/contextos podem adotar corte distinto. [16] MEEM alterado reforça suspeita, mas não confirma demência sozinho. Dispositivo de marcha é sinal de necessidade de avaliação, não justificativa para retirar um apoio indicado.</w:t>
+      </w:r>
+    </w:p>
+    <w:p>
+      <w:r>
+        <w:t>Incapacidade ou aplicação insegura de 5xSTS motiva avaliação clínica e pode registrar limitação de mobilidade confirmada; não atribuir tempo fictício. A revisão mais precoce por outro domínio ou intercorrência prevalece sobre o intervalo de 6–12 meses da pré-fragilidade.</w:t>
+      </w:r>
+    </w:p>
+    <w:p>
+      <w:pPr>
+        <w:pStyle w:val="Heading1"/>
+        <w:pageBreakBefore/>
+      </w:pPr>
+      <w:r>
+        <w:t>16 Discussão com o geriatra e reavaliação</w:t>
+      </w:r>
+    </w:p>
+    <w:p>
+      <w:r>
+        <w:drawing>
+          <wp:inline xmlns:a="http://schemas.openxmlformats.org/drawingml/2006/main" xmlns:pic="http://schemas.openxmlformats.org/drawingml/2006/picture">
+            <wp:extent cx="6035040" cy="3524930"/>
+            <wp:docPr id="4" name="Picture 4"/>
+            <wp:cNvGraphicFramePr>
+              <a:graphicFrameLocks noChangeAspect="1"/>
+            </wp:cNvGraphicFramePr>
+            <a:graphic>
+              <a:graphicData uri="http://schemas.openxmlformats.org/drawingml/2006/picture">
+                <pic:pic>
+                  <pic:nvPicPr>
+                    <pic:cNvPr id="0" name="fluxo_matriciamento.png"/>
+                    <pic:cNvPicPr/>
+                  </pic:nvPicPr>
+                  <pic:blipFill>
+                    <a:blip r:embed="rId13"/>
+                    <a:stretch>
+                      <a:fillRect/>
+                    </a:stretch>
+                  </pic:blipFill>
+                  <pic:spPr>
+                    <a:xfrm>
+                      <a:off x="0" y="0"/>
+                      <a:ext cx="6035040" cy="3524930"/>
+                    </a:xfrm>
+                    <a:prstGeom prst="rect"/>
+                  </pic:spPr>
+                </pic:pic>
+              </a:graphicData>
+            </a:graphic>
+          </wp:inline>
+        </w:drawing>
+      </w:r>
+    </w:p>
+    <w:p>
+      <w:pPr>
+        <w:pStyle w:val="Heading2"/>
+      </w:pPr>
+      <w:r>
+        <w:t>Regra única de discussão</w:t>
+      </w:r>
+    </w:p>
+    <w:p>
+      <w:r>
+        <w:t>Qualquer alteração em funcionalidade, locomoção, humor, cognição, fragilidade ou nutrição exige discussão com o geriatra do programa. A conduta inicial da equipe de família não dispensa a discussão. Matriciamento é discussão de caso e não implica necessariamente consulta presencial.</w:t>
+      </w:r>
+    </w:p>
+    <w:p>
+      <w:r>
+        <w:t>Alteração isolada: manter condução pela equipe de família, discutir com o geriatra e prever reavaliação em 3–6 meses, ajustada à necessidade clínica. Dois ou mais domínios alterados, FRAIL ≥3, declínio funcional agudo/progressivo ou suspeita de demência reforçada na avaliação de segundo nível: priorizar avaliação geriátrica ampla e seguimento compartilhado.</w:t>
+      </w:r>
+    </w:p>
+    <w:p>
+      <w:r>
+        <w:t>Demência já diagnosticada mantém FAST e planejamento compartilhado; não exigir novo 10-CS/MEEM para permitir discussão. Casos com diagnóstico e plano prévios devem ter continuidade definida conjuntamente. Rastreio completo sem alterações: hábitos saudáveis, atividade física e revisão anual, sem discussão obrigatória pelo protocolo.</w:t>
+      </w:r>
+    </w:p>
+    <w:p>
+      <w:pPr>
+        <w:pStyle w:val="Heading2"/>
+      </w:pPr>
+      <w:r>
+        <w:t>Fluxo de urgência independente</w:t>
+      </w:r>
+    </w:p>
+    <w:p>
+      <w:r>
+        <w:t>Ideação suicida requer avaliação imediata do risco; risco iminente segue urgência. Lesão relevante após queda, instabilidade clínica ou repercussões graves da desnutrição seguem atendimento prioritário/urgência conforme avaliação. Não aguardar matriciamento ou AGA para atender uma emergência. O escore isolado não determina a urgência.</w:t>
+      </w:r>
+    </w:p>
+    <w:p>
+      <w:pPr>
+        <w:pStyle w:val="Heading1"/>
+        <w:pageBreakBefore/>
+      </w:pPr>
+      <w:r>
+        <w:t>17 Regras de geração e critérios de aceite do painel</w:t>
+      </w:r>
+    </w:p>
+    <w:p>
+      <w:pPr>
+        <w:pStyle w:val="Heading2"/>
+      </w:pPr>
+      <w:r>
+        <w:t>Estado por domínio e recomendação de percurso</w:t>
+      </w:r>
+    </w:p>
+    <w:p>
+      <w:r>
+        <w:t>Gerar o painel a partir de dados persistidos, regras clínicas versionadas e um modelo de apresentação. Não calcular critérios no componente React. Um domínio recebe estado sem alteração, alterado, incompleto ou não realizado. Preservar o motivo e a versão da regra que produziram o estado.</w:t>
+      </w:r>
+    </w:p>
+    <w:p>
+      <w:r>
+        <w:t>Se houver pelo menos uma alteração válida, recomendar discussão com o geriatra mesmo que outro domínio esteja incompleto. Contar domínios distintos: Katz e Lawton alterados contam como uma alteração funcional; vários critérios motores contam como uma alteração de locomoção. FRAIL 1–2 ativa pré-fragilidade e matriciamento; FRAIL ≥3 ativa também prioridade para AGA.</w:t>
+      </w:r>
+    </w:p>
+    <w:p>
+      <w:r>
+        <w:t>Recomendar revisão anual sem discussão obrigatória apenas quando todos os domínios tiverem avaliação válida sem alterações. Em avaliação parcial, exibir “rastreio incompleto” e pendências; não declarar robustez ou baixo risco. Retorno sem reaplicação não transforma resultado histórico em resultado atual: mostrar data e distinguir informação atual de histórico.</w:t>
+      </w:r>
+    </w:p>
+    <w:p>
+      <w:pPr>
+        <w:pStyle w:val="Heading2"/>
+      </w:pPr>
+      <w:r>
+        <w:t>Registro do cuidado compartilhado</w:t>
+      </w:r>
+    </w:p>
+    <w:p>
+      <w:r>
+        <w:t>Persistir indicação de discussão, motivo, prioridade, estado pendente/discutido/encaminhado, profissional responsável, data, participantes e plano acordado. Se houver encaminhamento para AGA, registrar o destino e acompanhamento. Não marcar discussão como realizada apenas porque foi sugerida. Registrar prazo e confirmação de cada conduta.</w:t>
+      </w:r>
+    </w:p>
+    <w:p>
+      <w:pPr>
+        <w:pStyle w:val="Heading2"/>
+        <w:pageBreakBefore/>
+      </w:pPr>
+      <w:r>
+        <w:t>Cenários obrigatórios de homologação</w:t>
+      </w:r>
+    </w:p>
+    <w:tbl>
+      <w:tblPr>
+        <w:tblW w:type="auto" w:w="0"/>
+        <w:tblLayout w:type="fixed"/>
+        <w:tblLook w:firstColumn="1" w:firstRow="1" w:lastColumn="0" w:lastRow="0" w:noHBand="0" w:noVBand="1" w:val="04A0"/>
+      </w:tblPr>
+      <w:tblGrid>
+        <w:gridCol w:w="4248"/>
+        <w:gridCol w:w="5832"/>
+      </w:tblGrid>
+      <w:tr>
+        <w:trPr>
+          <w:cantSplit/>
+          <w:tblHeader/>
+        </w:trPr>
+        <w:tc>
+          <w:tcPr>
+            <w:tcW w:type="dxa" w:w="4248"/>
+            <w:vAlign w:val="center"/>
+            <w:shd w:fill="E7EFF2"/>
+            <w:tcBorders>
+              <w:top w:val="single" w:color="D9D9D9" w:sz="4"/>
+              <w:left w:val="single" w:color="D9D9D9" w:sz="4"/>
+              <w:bottom w:val="single" w:color="D9D9D9" w:sz="4"/>
+              <w:right w:val="single" w:color="D9D9D9" w:sz="4"/>
+            </w:tcBorders>
+            <w:tcMar>
+              <w:top w:w="95" w:type="dxa"/>
+              <w:left w:w="95" w:type="dxa"/>
+              <w:bottom w:w="95" w:type="dxa"/>
+              <w:right w:w="95" w:type="dxa"/>
+            </w:tcMar>
+          </w:tcPr>
+          <w:p>
+            <w:pPr>
+              <w:spacing w:after="60" w:before="60" w:line="247" w:lineRule="auto"/>
+            </w:pPr>
+            <w:r>
+              <w:rPr>
+                <w:b/>
+                <w:sz w:val="20"/>
+              </w:rPr>
+              <w:t>Cenário</w:t>
+            </w:r>
+          </w:p>
+        </w:tc>
+        <w:tc>
+          <w:tcPr>
+            <w:tcW w:type="dxa" w:w="5832"/>
+            <w:vAlign w:val="center"/>
+            <w:shd w:fill="E7EFF2"/>
+            <w:tcBorders>
+              <w:top w:val="single" w:color="D9D9D9" w:sz="4"/>
+              <w:left w:val="single" w:color="D9D9D9" w:sz="4"/>
+              <w:bottom w:val="single" w:color="D9D9D9" w:sz="4"/>
+              <w:right w:val="single" w:color="D9D9D9" w:sz="4"/>
+            </w:tcBorders>
+            <w:tcMar>
+              <w:top w:w="95" w:type="dxa"/>
+              <w:left w:w="95" w:type="dxa"/>
+              <w:bottom w:w="95" w:type="dxa"/>
+              <w:right w:w="95" w:type="dxa"/>
+            </w:tcMar>
+          </w:tcPr>
+          <w:p>
+            <w:pPr>
+              <w:spacing w:after="60" w:before="60" w:line="247" w:lineRule="auto"/>
+            </w:pPr>
+            <w:r>
+              <w:rPr>
+                <w:b/>
+                <w:sz w:val="20"/>
+              </w:rPr>
+              <w:t>Resultado esperado</w:t>
+            </w:r>
+          </w:p>
+        </w:tc>
+      </w:tr>
+      <w:tr>
+        <w:trPr>
+          <w:cantSplit/>
+        </w:trPr>
+        <w:tc>
+          <w:tcPr>
+            <w:tcW w:type="dxa" w:w="4248"/>
+            <w:vAlign w:val="center"/>
+            <w:shd w:fill="FFFFFF"/>
+            <w:tcBorders>
+              <w:top w:val="single" w:color="D9D9D9" w:sz="4"/>
+              <w:left w:val="single" w:color="D9D9D9" w:sz="4"/>
+              <w:bottom w:val="single" w:color="D9D9D9" w:sz="4"/>
+              <w:right w:val="single" w:color="D9D9D9" w:sz="4"/>
+            </w:tcBorders>
+            <w:tcMar>
+              <w:top w:w="95" w:type="dxa"/>
+              <w:left w:w="95" w:type="dxa"/>
+              <w:bottom w:w="95" w:type="dxa"/>
+              <w:right w:w="95" w:type="dxa"/>
+            </w:tcMar>
+          </w:tcPr>
+          <w:p>
+            <w:pPr>
+              <w:spacing w:after="60" w:before="60" w:line="247" w:lineRule="auto"/>
+            </w:pPr>
+            <w:r>
+              <w:rPr>
+                <w:b w:val="0"/>
+                <w:sz w:val="20"/>
+              </w:rPr>
+              <w:t>Seis domínios completos sem alteração</w:t>
+            </w:r>
+          </w:p>
+        </w:tc>
+        <w:tc>
+          <w:tcPr>
+            <w:tcW w:type="dxa" w:w="5832"/>
+            <w:vAlign w:val="center"/>
+            <w:shd w:fill="FFFFFF"/>
+            <w:tcBorders>
+              <w:top w:val="single" w:color="D9D9D9" w:sz="4"/>
+              <w:left w:val="single" w:color="D9D9D9" w:sz="4"/>
+              <w:bottom w:val="single" w:color="D9D9D9" w:sz="4"/>
+              <w:right w:val="single" w:color="D9D9D9" w:sz="4"/>
+            </w:tcBorders>
+            <w:tcMar>
+              <w:top w:w="95" w:type="dxa"/>
+              <w:left w:w="95" w:type="dxa"/>
+              <w:bottom w:w="95" w:type="dxa"/>
+              <w:right w:w="95" w:type="dxa"/>
+            </w:tcMar>
+          </w:tcPr>
+          <w:p>
+            <w:pPr>
+              <w:spacing w:after="60" w:before="60" w:line="247" w:lineRule="auto"/>
+            </w:pPr>
+            <w:r>
+              <w:rPr>
+                <w:b w:val="0"/>
+                <w:sz w:val="20"/>
+              </w:rPr>
+              <w:t>Prevenção e revisão anual; sem discussão obrigatória.</w:t>
+            </w:r>
+          </w:p>
+        </w:tc>
+      </w:tr>
+      <w:tr>
+        <w:trPr>
+          <w:cantSplit/>
+        </w:trPr>
+        <w:tc>
+          <w:tcPr>
+            <w:tcW w:type="dxa" w:w="4248"/>
+            <w:vAlign w:val="center"/>
+            <w:shd w:fill="FFFFFF"/>
+            <w:tcBorders>
+              <w:top w:val="single" w:color="D9D9D9" w:sz="4"/>
+              <w:left w:val="single" w:color="D9D9D9" w:sz="4"/>
+              <w:bottom w:val="single" w:color="D9D9D9" w:sz="4"/>
+              <w:right w:val="single" w:color="D9D9D9" w:sz="4"/>
+            </w:tcBorders>
+            <w:tcMar>
+              <w:top w:w="95" w:type="dxa"/>
+              <w:left w:w="95" w:type="dxa"/>
+              <w:bottom w:w="95" w:type="dxa"/>
+              <w:right w:w="95" w:type="dxa"/>
+            </w:tcMar>
+          </w:tcPr>
+          <w:p>
+            <w:pPr>
+              <w:spacing w:after="60" w:before="60" w:line="247" w:lineRule="auto"/>
+            </w:pPr>
+            <w:r>
+              <w:rPr>
+                <w:b w:val="0"/>
+                <w:sz w:val="20"/>
+              </w:rPr>
+              <w:t>Uma alteração, conduta já iniciada</w:t>
+            </w:r>
+          </w:p>
+        </w:tc>
+        <w:tc>
+          <w:tcPr>
+            <w:tcW w:type="dxa" w:w="5832"/>
+            <w:vAlign w:val="center"/>
+            <w:shd w:fill="FFFFFF"/>
+            <w:tcBorders>
+              <w:top w:val="single" w:color="D9D9D9" w:sz="4"/>
+              <w:left w:val="single" w:color="D9D9D9" w:sz="4"/>
+              <w:bottom w:val="single" w:color="D9D9D9" w:sz="4"/>
+              <w:right w:val="single" w:color="D9D9D9" w:sz="4"/>
+            </w:tcBorders>
+            <w:tcMar>
+              <w:top w:w="95" w:type="dxa"/>
+              <w:left w:w="95" w:type="dxa"/>
+              <w:bottom w:w="95" w:type="dxa"/>
+              <w:right w:w="95" w:type="dxa"/>
+            </w:tcMar>
+          </w:tcPr>
+          <w:p>
+            <w:pPr>
+              <w:spacing w:after="60" w:before="60" w:line="247" w:lineRule="auto"/>
+            </w:pPr>
+            <w:r>
+              <w:rPr>
+                <w:b w:val="0"/>
+                <w:sz w:val="20"/>
+              </w:rPr>
+              <w:t>Orientação específica e matriciamento continuam indicados.</w:t>
+            </w:r>
+          </w:p>
+        </w:tc>
+      </w:tr>
+      <w:tr>
+        <w:trPr>
+          <w:cantSplit/>
+        </w:trPr>
+        <w:tc>
+          <w:tcPr>
+            <w:tcW w:type="dxa" w:w="4248"/>
+            <w:vAlign w:val="center"/>
+            <w:shd w:fill="FFFFFF"/>
+            <w:tcBorders>
+              <w:top w:val="single" w:color="D9D9D9" w:sz="4"/>
+              <w:left w:val="single" w:color="D9D9D9" w:sz="4"/>
+              <w:bottom w:val="single" w:color="D9D9D9" w:sz="4"/>
+              <w:right w:val="single" w:color="D9D9D9" w:sz="4"/>
+            </w:tcBorders>
+            <w:tcMar>
+              <w:top w:w="95" w:type="dxa"/>
+              <w:left w:w="95" w:type="dxa"/>
+              <w:bottom w:w="95" w:type="dxa"/>
+              <w:right w:w="95" w:type="dxa"/>
+            </w:tcMar>
+          </w:tcPr>
+          <w:p>
+            <w:pPr>
+              <w:spacing w:after="60" w:before="60" w:line="247" w:lineRule="auto"/>
+            </w:pPr>
+            <w:r>
+              <w:rPr>
+                <w:b w:val="0"/>
+                <w:sz w:val="20"/>
+              </w:rPr>
+              <w:t>Duas escalas do mesmo domínio alteradas</w:t>
+            </w:r>
+          </w:p>
+        </w:tc>
+        <w:tc>
+          <w:tcPr>
+            <w:tcW w:type="dxa" w:w="5832"/>
+            <w:vAlign w:val="center"/>
+            <w:shd w:fill="FFFFFF"/>
+            <w:tcBorders>
+              <w:top w:val="single" w:color="D9D9D9" w:sz="4"/>
+              <w:left w:val="single" w:color="D9D9D9" w:sz="4"/>
+              <w:bottom w:val="single" w:color="D9D9D9" w:sz="4"/>
+              <w:right w:val="single" w:color="D9D9D9" w:sz="4"/>
+            </w:tcBorders>
+            <w:tcMar>
+              <w:top w:w="95" w:type="dxa"/>
+              <w:left w:w="95" w:type="dxa"/>
+              <w:bottom w:w="95" w:type="dxa"/>
+              <w:right w:w="95" w:type="dxa"/>
+            </w:tcMar>
+          </w:tcPr>
+          <w:p>
+            <w:pPr>
+              <w:spacing w:after="60" w:before="60" w:line="247" w:lineRule="auto"/>
+            </w:pPr>
+            <w:r>
+              <w:rPr>
+                <w:b w:val="0"/>
+                <w:sz w:val="20"/>
+              </w:rPr>
+              <w:t>Contar um domínio; não priorizar AGA apenas por duplicidade.</w:t>
+            </w:r>
+          </w:p>
+        </w:tc>
+      </w:tr>
+      <w:tr>
+        <w:trPr>
+          <w:cantSplit/>
+        </w:trPr>
+        <w:tc>
+          <w:tcPr>
+            <w:tcW w:type="dxa" w:w="4248"/>
+            <w:vAlign w:val="center"/>
+            <w:shd w:fill="FFFFFF"/>
+            <w:tcBorders>
+              <w:top w:val="single" w:color="D9D9D9" w:sz="4"/>
+              <w:left w:val="single" w:color="D9D9D9" w:sz="4"/>
+              <w:bottom w:val="single" w:color="D9D9D9" w:sz="4"/>
+              <w:right w:val="single" w:color="D9D9D9" w:sz="4"/>
+            </w:tcBorders>
+            <w:tcMar>
+              <w:top w:w="95" w:type="dxa"/>
+              <w:left w:w="95" w:type="dxa"/>
+              <w:bottom w:w="95" w:type="dxa"/>
+              <w:right w:w="95" w:type="dxa"/>
+            </w:tcMar>
+          </w:tcPr>
+          <w:p>
+            <w:pPr>
+              <w:spacing w:after="60" w:before="60" w:line="247" w:lineRule="auto"/>
+            </w:pPr>
+            <w:r>
+              <w:rPr>
+                <w:b w:val="0"/>
+                <w:sz w:val="20"/>
+              </w:rPr>
+              <w:t>Dois domínios alterados ou FRAIL ≥3</w:t>
+            </w:r>
+          </w:p>
+        </w:tc>
+        <w:tc>
+          <w:tcPr>
+            <w:tcW w:type="dxa" w:w="5832"/>
+            <w:vAlign w:val="center"/>
+            <w:shd w:fill="FFFFFF"/>
+            <w:tcBorders>
+              <w:top w:val="single" w:color="D9D9D9" w:sz="4"/>
+              <w:left w:val="single" w:color="D9D9D9" w:sz="4"/>
+              <w:bottom w:val="single" w:color="D9D9D9" w:sz="4"/>
+              <w:right w:val="single" w:color="D9D9D9" w:sz="4"/>
+            </w:tcBorders>
+            <w:tcMar>
+              <w:top w:w="95" w:type="dxa"/>
+              <w:left w:w="95" w:type="dxa"/>
+              <w:bottom w:w="95" w:type="dxa"/>
+              <w:right w:w="95" w:type="dxa"/>
+            </w:tcMar>
+          </w:tcPr>
+          <w:p>
+            <w:pPr>
+              <w:spacing w:after="60" w:before="60" w:line="247" w:lineRule="auto"/>
+            </w:pPr>
+            <w:r>
+              <w:rPr>
+                <w:b w:val="0"/>
+                <w:sz w:val="20"/>
+              </w:rPr>
+              <w:t>Priorizar AGA e plano compartilhado.</w:t>
+            </w:r>
+          </w:p>
+        </w:tc>
+      </w:tr>
+      <w:tr>
+        <w:trPr>
+          <w:cantSplit/>
+        </w:trPr>
+        <w:tc>
+          <w:tcPr>
+            <w:tcW w:type="dxa" w:w="4248"/>
+            <w:vAlign w:val="center"/>
+            <w:shd w:fill="FFFFFF"/>
+            <w:tcBorders>
+              <w:top w:val="single" w:color="D9D9D9" w:sz="4"/>
+              <w:left w:val="single" w:color="D9D9D9" w:sz="4"/>
+              <w:bottom w:val="single" w:color="D9D9D9" w:sz="4"/>
+              <w:right w:val="single" w:color="D9D9D9" w:sz="4"/>
+            </w:tcBorders>
+            <w:tcMar>
+              <w:top w:w="95" w:type="dxa"/>
+              <w:left w:w="95" w:type="dxa"/>
+              <w:bottom w:w="95" w:type="dxa"/>
+              <w:right w:w="95" w:type="dxa"/>
+            </w:tcMar>
+          </w:tcPr>
+          <w:p>
+            <w:pPr>
+              <w:spacing w:after="60" w:before="60" w:line="247" w:lineRule="auto"/>
+            </w:pPr>
+            <w:r>
+              <w:rPr>
+                <w:b w:val="0"/>
+                <w:sz w:val="20"/>
+              </w:rPr>
+              <w:t>FRAIL 1–2 isolado</w:t>
+            </w:r>
+          </w:p>
+        </w:tc>
+        <w:tc>
+          <w:tcPr>
+            <w:tcW w:type="dxa" w:w="5832"/>
+            <w:vAlign w:val="center"/>
+            <w:shd w:fill="FFFFFF"/>
+            <w:tcBorders>
+              <w:top w:val="single" w:color="D9D9D9" w:sz="4"/>
+              <w:left w:val="single" w:color="D9D9D9" w:sz="4"/>
+              <w:bottom w:val="single" w:color="D9D9D9" w:sz="4"/>
+              <w:right w:val="single" w:color="D9D9D9" w:sz="4"/>
+            </w:tcBorders>
+            <w:tcMar>
+              <w:top w:w="95" w:type="dxa"/>
+              <w:left w:w="95" w:type="dxa"/>
+              <w:bottom w:w="95" w:type="dxa"/>
+              <w:right w:w="95" w:type="dxa"/>
+            </w:tcMar>
+          </w:tcPr>
+          <w:p>
+            <w:pPr>
+              <w:spacing w:after="60" w:before="60" w:line="247" w:lineRule="auto"/>
+            </w:pPr>
+            <w:r>
+              <w:rPr>
+                <w:b w:val="0"/>
+                <w:sz w:val="20"/>
+              </w:rPr>
+              <w:t>Matriciamento, cuidado inicial e prazo individualizado; pré-fragilidade preservada.</w:t>
+            </w:r>
+          </w:p>
+        </w:tc>
+      </w:tr>
+      <w:tr>
+        <w:trPr>
+          <w:cantSplit/>
+        </w:trPr>
+        <w:tc>
+          <w:tcPr>
+            <w:tcW w:type="dxa" w:w="4248"/>
+            <w:vAlign w:val="center"/>
+            <w:shd w:fill="FFFFFF"/>
+            <w:tcBorders>
+              <w:top w:val="single" w:color="D9D9D9" w:sz="4"/>
+              <w:left w:val="single" w:color="D9D9D9" w:sz="4"/>
+              <w:bottom w:val="single" w:color="D9D9D9" w:sz="4"/>
+              <w:right w:val="single" w:color="D9D9D9" w:sz="4"/>
+            </w:tcBorders>
+            <w:tcMar>
+              <w:top w:w="95" w:type="dxa"/>
+              <w:left w:w="95" w:type="dxa"/>
+              <w:bottom w:w="95" w:type="dxa"/>
+              <w:right w:w="95" w:type="dxa"/>
+            </w:tcMar>
+          </w:tcPr>
+          <w:p>
+            <w:pPr>
+              <w:spacing w:after="60" w:before="60" w:line="247" w:lineRule="auto"/>
+            </w:pPr>
+            <w:r>
+              <w:rPr>
+                <w:b w:val="0"/>
+                <w:sz w:val="20"/>
+              </w:rPr>
+              <w:t>GDS-5 1/2; GDS-15 4/5; 5xSTS 15/&gt;15</w:t>
+            </w:r>
+          </w:p>
+        </w:tc>
+        <w:tc>
+          <w:tcPr>
+            <w:tcW w:type="dxa" w:w="5832"/>
+            <w:vAlign w:val="center"/>
+            <w:shd w:fill="FFFFFF"/>
+            <w:tcBorders>
+              <w:top w:val="single" w:color="D9D9D9" w:sz="4"/>
+              <w:left w:val="single" w:color="D9D9D9" w:sz="4"/>
+              <w:bottom w:val="single" w:color="D9D9D9" w:sz="4"/>
+              <w:right w:val="single" w:color="D9D9D9" w:sz="4"/>
+            </w:tcBorders>
+            <w:tcMar>
+              <w:top w:w="95" w:type="dxa"/>
+              <w:left w:w="95" w:type="dxa"/>
+              <w:bottom w:w="95" w:type="dxa"/>
+              <w:right w:w="95" w:type="dxa"/>
+            </w:tcMar>
+          </w:tcPr>
+          <w:p>
+            <w:pPr>
+              <w:spacing w:after="60" w:before="60" w:line="247" w:lineRule="auto"/>
+            </w:pPr>
+            <w:r>
+              <w:rPr>
+                <w:b w:val="0"/>
+                <w:sz w:val="20"/>
+              </w:rPr>
+              <w:t>Ativar somente no limiar correto; não inferir gravidade ou diagnóstico.</w:t>
+            </w:r>
+          </w:p>
+        </w:tc>
+      </w:tr>
+      <w:tr>
+        <w:trPr>
+          <w:cantSplit/>
+        </w:trPr>
+        <w:tc>
+          <w:tcPr>
+            <w:tcW w:type="dxa" w:w="4248"/>
+            <w:vAlign w:val="center"/>
+            <w:shd w:fill="FFFFFF"/>
+            <w:tcBorders>
+              <w:top w:val="single" w:color="D9D9D9" w:sz="4"/>
+              <w:left w:val="single" w:color="D9D9D9" w:sz="4"/>
+              <w:bottom w:val="single" w:color="D9D9D9" w:sz="4"/>
+              <w:right w:val="single" w:color="D9D9D9" w:sz="4"/>
+            </w:tcBorders>
+            <w:tcMar>
+              <w:top w:w="95" w:type="dxa"/>
+              <w:left w:w="95" w:type="dxa"/>
+              <w:bottom w:w="95" w:type="dxa"/>
+              <w:right w:w="95" w:type="dxa"/>
+            </w:tcMar>
+          </w:tcPr>
+          <w:p>
+            <w:pPr>
+              <w:spacing w:after="60" w:before="60" w:line="247" w:lineRule="auto"/>
+            </w:pPr>
+            <w:r>
+              <w:rPr>
+                <w:b w:val="0"/>
+                <w:sz w:val="20"/>
+              </w:rPr>
+              <w:t>10-CS 5/6/7/8; demência diagnosticada</w:t>
+            </w:r>
+          </w:p>
+        </w:tc>
+        <w:tc>
+          <w:tcPr>
+            <w:tcW w:type="dxa" w:w="5832"/>
+            <w:vAlign w:val="center"/>
+            <w:shd w:fill="FFFFFF"/>
+            <w:tcBorders>
+              <w:top w:val="single" w:color="D9D9D9" w:sz="4"/>
+              <w:left w:val="single" w:color="D9D9D9" w:sz="4"/>
+              <w:bottom w:val="single" w:color="D9D9D9" w:sz="4"/>
+              <w:right w:val="single" w:color="D9D9D9" w:sz="4"/>
+            </w:tcBorders>
+            <w:tcMar>
+              <w:top w:w="95" w:type="dxa"/>
+              <w:left w:w="95" w:type="dxa"/>
+              <w:bottom w:w="95" w:type="dxa"/>
+              <w:right w:w="95" w:type="dxa"/>
+            </w:tcMar>
+          </w:tcPr>
+          <w:p>
+            <w:pPr>
+              <w:spacing w:after="60" w:before="60" w:line="247" w:lineRule="auto"/>
+            </w:pPr>
+            <w:r>
+              <w:rPr>
+                <w:b w:val="0"/>
+                <w:sz w:val="20"/>
+              </w:rPr>
+              <w:t>Faixas corretas e MEEM quando indicado; FAST no diagnóstico prévio.</w:t>
+            </w:r>
+          </w:p>
+        </w:tc>
+      </w:tr>
+      <w:tr>
+        <w:trPr>
+          <w:cantSplit/>
+        </w:trPr>
+        <w:tc>
+          <w:tcPr>
+            <w:tcW w:type="dxa" w:w="4248"/>
+            <w:vAlign w:val="center"/>
+            <w:shd w:fill="FFFFFF"/>
+            <w:tcBorders>
+              <w:top w:val="single" w:color="D9D9D9" w:sz="4"/>
+              <w:left w:val="single" w:color="D9D9D9" w:sz="4"/>
+              <w:bottom w:val="single" w:color="D9D9D9" w:sz="4"/>
+              <w:right w:val="single" w:color="D9D9D9" w:sz="4"/>
+            </w:tcBorders>
+            <w:tcMar>
+              <w:top w:w="95" w:type="dxa"/>
+              <w:left w:w="95" w:type="dxa"/>
+              <w:bottom w:w="95" w:type="dxa"/>
+              <w:right w:w="95" w:type="dxa"/>
+            </w:tcMar>
+          </w:tcPr>
+          <w:p>
+            <w:pPr>
+              <w:spacing w:after="60" w:before="60" w:line="247" w:lineRule="auto"/>
+            </w:pPr>
+            <w:r>
+              <w:rPr>
+                <w:b w:val="0"/>
+                <w:sz w:val="20"/>
+              </w:rPr>
+              <w:t>MNA-SF 7/8/11/12; perda &gt;3 kg</w:t>
+            </w:r>
+          </w:p>
+        </w:tc>
+        <w:tc>
+          <w:tcPr>
+            <w:tcW w:type="dxa" w:w="5832"/>
+            <w:vAlign w:val="center"/>
+            <w:shd w:fill="FFFFFF"/>
+            <w:tcBorders>
+              <w:top w:val="single" w:color="D9D9D9" w:sz="4"/>
+              <w:left w:val="single" w:color="D9D9D9" w:sz="4"/>
+              <w:bottom w:val="single" w:color="D9D9D9" w:sz="4"/>
+              <w:right w:val="single" w:color="D9D9D9" w:sz="4"/>
+            </w:tcBorders>
+            <w:tcMar>
+              <w:top w:w="95" w:type="dxa"/>
+              <w:left w:w="95" w:type="dxa"/>
+              <w:bottom w:w="95" w:type="dxa"/>
+              <w:right w:w="95" w:type="dxa"/>
+            </w:tcMar>
+          </w:tcPr>
+          <w:p>
+            <w:pPr>
+              <w:spacing w:after="60" w:before="60" w:line="247" w:lineRule="auto"/>
+            </w:pPr>
+            <w:r>
+              <w:rPr>
+                <w:b w:val="0"/>
+                <w:sz w:val="20"/>
+              </w:rPr>
+              <w:t>Classificação correta; alerta de peso independente do escore.</w:t>
+            </w:r>
+          </w:p>
+        </w:tc>
+      </w:tr>
+      <w:tr>
+        <w:trPr>
+          <w:cantSplit/>
+        </w:trPr>
+        <w:tc>
+          <w:tcPr>
+            <w:tcW w:type="dxa" w:w="4248"/>
+            <w:vAlign w:val="center"/>
+            <w:shd w:fill="FFFFFF"/>
+            <w:tcBorders>
+              <w:top w:val="single" w:color="D9D9D9" w:sz="4"/>
+              <w:left w:val="single" w:color="D9D9D9" w:sz="4"/>
+              <w:bottom w:val="single" w:color="D9D9D9" w:sz="4"/>
+              <w:right w:val="single" w:color="D9D9D9" w:sz="4"/>
+            </w:tcBorders>
+            <w:tcMar>
+              <w:top w:w="95" w:type="dxa"/>
+              <w:left w:w="95" w:type="dxa"/>
+              <w:bottom w:w="95" w:type="dxa"/>
+              <w:right w:w="95" w:type="dxa"/>
+            </w:tcMar>
+          </w:tcPr>
+          <w:p>
+            <w:pPr>
+              <w:spacing w:after="60" w:before="60" w:line="247" w:lineRule="auto"/>
+            </w:pPr>
+            <w:r>
+              <w:rPr>
+                <w:b w:val="0"/>
+                <w:sz w:val="20"/>
+              </w:rPr>
+              <w:t>Resultado ausente ou apenas histórico</w:t>
+            </w:r>
+          </w:p>
+        </w:tc>
+        <w:tc>
+          <w:tcPr>
+            <w:tcW w:type="dxa" w:w="5832"/>
+            <w:vAlign w:val="center"/>
+            <w:shd w:fill="FFFFFF"/>
+            <w:tcBorders>
+              <w:top w:val="single" w:color="D9D9D9" w:sz="4"/>
+              <w:left w:val="single" w:color="D9D9D9" w:sz="4"/>
+              <w:bottom w:val="single" w:color="D9D9D9" w:sz="4"/>
+              <w:right w:val="single" w:color="D9D9D9" w:sz="4"/>
+            </w:tcBorders>
+            <w:tcMar>
+              <w:top w:w="95" w:type="dxa"/>
+              <w:left w:w="95" w:type="dxa"/>
+              <w:bottom w:w="95" w:type="dxa"/>
+              <w:right w:w="95" w:type="dxa"/>
+            </w:tcMar>
+          </w:tcPr>
+          <w:p>
+            <w:pPr>
+              <w:spacing w:after="60" w:before="60" w:line="247" w:lineRule="auto"/>
+            </w:pPr>
+            <w:r>
+              <w:rPr>
+                <w:b w:val="0"/>
+                <w:sz w:val="20"/>
+              </w:rPr>
+              <w:t>Não declarar normalidade; indicação válida em outro domínio preservada.</w:t>
+            </w:r>
+          </w:p>
+        </w:tc>
+      </w:tr>
+      <w:tr>
+        <w:trPr>
+          <w:cantSplit/>
+        </w:trPr>
+        <w:tc>
+          <w:tcPr>
+            <w:tcW w:type="dxa" w:w="4248"/>
+            <w:vAlign w:val="center"/>
+            <w:shd w:fill="FFFFFF"/>
+            <w:tcBorders>
+              <w:top w:val="single" w:color="D9D9D9" w:sz="4"/>
+              <w:left w:val="single" w:color="D9D9D9" w:sz="4"/>
+              <w:bottom w:val="single" w:color="D9D9D9" w:sz="4"/>
+              <w:right w:val="single" w:color="D9D9D9" w:sz="4"/>
+            </w:tcBorders>
+            <w:tcMar>
+              <w:top w:w="95" w:type="dxa"/>
+              <w:left w:w="95" w:type="dxa"/>
+              <w:bottom w:w="95" w:type="dxa"/>
+              <w:right w:w="95" w:type="dxa"/>
+            </w:tcMar>
+          </w:tcPr>
+          <w:p>
+            <w:pPr>
+              <w:spacing w:after="60" w:before="60" w:line="247" w:lineRule="auto"/>
+            </w:pPr>
+            <w:r>
+              <w:rPr>
+                <w:b w:val="0"/>
+                <w:sz w:val="20"/>
+              </w:rPr>
+              <w:t>Urgência e exportação familiar</w:t>
+            </w:r>
+          </w:p>
+        </w:tc>
+        <w:tc>
+          <w:tcPr>
+            <w:tcW w:type="dxa" w:w="5832"/>
+            <w:vAlign w:val="center"/>
+            <w:shd w:fill="FFFFFF"/>
+            <w:tcBorders>
+              <w:top w:val="single" w:color="D9D9D9" w:sz="4"/>
+              <w:left w:val="single" w:color="D9D9D9" w:sz="4"/>
+              <w:bottom w:val="single" w:color="D9D9D9" w:sz="4"/>
+              <w:right w:val="single" w:color="D9D9D9" w:sz="4"/>
+            </w:tcBorders>
+            <w:tcMar>
+              <w:top w:w="95" w:type="dxa"/>
+              <w:left w:w="95" w:type="dxa"/>
+              <w:bottom w:w="95" w:type="dxa"/>
+              <w:right w:w="95" w:type="dxa"/>
+            </w:tcMar>
+          </w:tcPr>
+          <w:p>
+            <w:pPr>
+              <w:spacing w:after="60" w:before="60" w:line="247" w:lineRule="auto"/>
+            </w:pPr>
+            <w:r>
+              <w:rPr>
+                <w:b w:val="0"/>
+                <w:sz w:val="20"/>
+              </w:rPr>
+              <w:t>Fluxo de urgência independente; texto técnico separado e conduta confirmada.</w:t>
+            </w:r>
+          </w:p>
+        </w:tc>
+      </w:tr>
+    </w:tbl>
+    <w:p/>
+    <w:p>
+      <w:r>
+        <w:t>[15] CDC. STEADI Algorithm for Fall Risk Screening, Assessment and Intervention. https://stacks.cdc.gov/view/cdc/123853</w:t>
+      </w:r>
+    </w:p>
+    <w:p>
+      <w:r>
+        <w:t>[16] Validity of the Brazilian version of the Geriatric Depression Scale among primary care patients. https://pubmed.ncbi.nlm.nih.gov/19883523/</w:t>
+      </w:r>
+    </w:p>
     <w:sectPr>
       <w:footerReference w:type="default" r:id="rId9"/>
       <w:pgSz w:w="12240" w:h="15840"/>
@@ -6699,7 +8407,7 @@
       <w:rPr>
         <w:sz w:val="18"/>
       </w:rPr>
-      <w:t xml:space="preserve">Prontuário Aprimorado | Especificação 1.2 | </w:t>
+      <w:t xml:space="preserve">Prontuário Aprimorado | Especificação 1.3 | </w:t>
     </w:r>
     <w:fldSimple w:instr="PAGE"/>
   </w:p>

</xml_diff>

<commit_message>
docs: inclui continência e insônia no fluxo geriátrico v1.4
</commit_message>
<xml_diff>
--- a/docs/projeto-saude-da-familia.docx
+++ b/docs/projeto-saude-da-familia.docx
@@ -7,7 +7,7 @@
         <w:pStyle w:val="Title"/>
       </w:pPr>
       <w:r>
-        <w:t>Projeto do prontuário para medicina de família</w:t>
+        <w:t>Projeto Saúde da Família</w:t>
       </w:r>
     </w:p>
     <w:p>
@@ -20,7 +20,7 @@
     </w:p>
     <w:p>
       <w:r>
-        <w:t>Especificação funcional e técnica para engenharia de software | Versão 1.3 | 8 de outubro de 2026</w:t>
+        <w:t>Especificação funcional e técnica para engenharia de software | Versão 1.4 | 10 de outubro de 2026</w:t>
       </w:r>
     </w:p>
     <w:p>
@@ -86,10 +86,7 @@
         <w:pStyle w:val="ListBullet"/>
       </w:pPr>
       <w:r>
-        <w:t>Integração com cadastro, medicamentos, problemas, exames, prevenção e permissões já existentes.</w:t>
-      </w:r>
-      <w:r>
-        <w:t xml:space="preserve"> Incluir visão, audição, carga de doenças, polifarmácia e internação recente; aplicar LACE no percurso pós-internação.</w:t>
+        <w:t>Integração com cadastro, medicamentos, problemas, exames, prevenção e permissões já existentes. Incluir visão, audição, carga de doenças, polifarmácia e internação recente; aplicar LACE no percurso pós-internação. Incluir checkboxes independentes de incontinência urinária, incontinência fecal e insônia, cada um com indicação de discussão geriátrica se positivo.</w:t>
       </w:r>
     </w:p>
     <w:p>
@@ -6688,7 +6685,7 @@
     </w:p>
     <w:p>
       <w:r>
-        <w:t>Adicionar o botão “Informações técnicas” ao relatório final do Projeto Saúde da Família. Ao clicar, o médico abre orientações profissionais baseadas nos seis domínios de rastreio da consulta e no fluxo de cuidado compartilhado com o geriatra do programa. A regra central é: qualquer domínio alterado exige discussão do caso, mesmo quando a equipe de família já iniciou a conduta.</w:t>
+        <w:t>Adicionar o botão “Informações técnicas” ao relatório final do Projeto Saúde da Família. Ao clicar, o médico abre orientações pelos seis domínios e pelos itens de continência e sono. Qualquer alteração nos seis domínios ou resposta positiva para incontinência urinária, incontinência fecal ou insônia exige discussão com o geriatra do programa, mesmo com conduta inicial já iniciada.</w:t>
       </w:r>
     </w:p>
     <w:p>
@@ -7545,7 +7542,7 @@
     </w:p>
     <w:p>
       <w:r>
-        <w:t>Qualquer alteração em funcionalidade, locomoção, humor, cognição, fragilidade ou nutrição exige discussão com o geriatra do programa. A conduta inicial da equipe de família não dispensa a discussão. Matriciamento é discussão de caso e não implica necessariamente consulta presencial.</w:t>
+        <w:t>Qualquer alteração nos seis domínios ou resposta positiva para incontinência urinária, incontinência fecal ou insônia exige discussão com o geriatra do programa, mesmo com conduta inicial já iniciada. Matriciamento é discussão de caso e não implica necessariamente consulta presencial.</w:t>
       </w:r>
     </w:p>
     <w:p>
@@ -7555,7 +7552,7 @@
     </w:p>
     <w:p>
       <w:r>
-        <w:t>Demência já diagnosticada mantém FAST e planejamento compartilhado; não exigir novo 10-CS/MEEM para permitir discussão. Casos com diagnóstico e plano prévios devem ter continuidade definida conjuntamente. Rastreio completo sem alterações: hábitos saudáveis, atividade física e revisão anual, sem discussão obrigatória pelo protocolo.</w:t>
+        <w:t>Demência já diagnosticada mantém FAST e planejamento compartilhado; não exigir novo 10-CS/MEEM para permitir discussão. Casos com diagnóstico e plano prévios devem ter continuidade definida conjuntamente. Rastreio completo sem alterações e três itens adicionais negativos: hábitos saudáveis, atividade física e revisão anual, sem discussão obrigatória pelo protocolo.</w:t>
       </w:r>
     </w:p>
     <w:p>
@@ -7595,12 +7592,12 @@
     </w:p>
     <w:p>
       <w:r>
-        <w:t>Se houver pelo menos uma alteração válida, recomendar discussão com o geriatra mesmo que outro domínio esteja incompleto. Contar domínios distintos: Katz e Lawton alterados contam como uma alteração funcional; vários critérios motores contam como uma alteração de locomoção. FRAIL 1–2 ativa pré-fragilidade e matriciamento; FRAIL ≥3 ativa também prioridade para AGA.</w:t>
+        <w:t>Se houver pelo menos uma alteração válida, recomendar discussão com o geriatra mesmo que outro domínio esteja incompleto. Contar domínios distintos: Katz e Lawton alterados contam como uma alteração funcional; vários critérios motores contam como uma alteração de locomoção. FRAIL 1–2 ativa pré-fragilidade e matriciamento; FRAIL ≥3 ativa também prioridade para AGA. Qualquer um dos três itens adicionais positivo também ativa a discussão, sem somar um domínio fictício ou alterar escores.</w:t>
       </w:r>
     </w:p>
     <w:p>
       <w:r>
-        <w:t>Recomendar revisão anual sem discussão obrigatória apenas quando todos os domínios tiverem avaliação válida sem alterações. Em avaliação parcial, exibir “rastreio incompleto” e pendências; não declarar robustez ou baixo risco. Retorno sem reaplicação não transforma resultado histórico em resultado atual: mostrar data e distinguir informação atual de histórico.</w:t>
+        <w:t>Recomendar revisão anual sem discussão obrigatória apenas quando todos os seis domínios tiverem avaliação válida sem alterações e os três itens adicionais estiverem respondidos negativamente. Em avaliação parcial, exibir “rastreio incompleto” e pendências; não declarar robustez ou baixo risco. Retorno sem reaplicação não transforma resultado histórico em resultado atual: mostrar data e distinguir informação atual de histórico.</w:t>
       </w:r>
     </w:p>
     <w:p>
@@ -7726,15 +7723,8 @@
             </w:tcMar>
           </w:tcPr>
           <w:p>
-            <w:pPr>
-              <w:spacing w:after="60" w:before="60" w:line="247" w:lineRule="auto"/>
-            </w:pPr>
             <w:r>
-              <w:rPr>
-                <w:b w:val="0"/>
-                <w:sz w:val="20"/>
-              </w:rPr>
-              <w:t>Seis domínios completos sem alteração</w:t>
+              <w:t>Seis domínios completos sem alteração e três itens adicionais negativos</w:t>
             </w:r>
           </w:p>
         </w:tc>
@@ -8385,6 +8375,275 @@
         <w:t>[16] Validity of the Brazilian version of the Geriatric Depression Scale among primary care patients. https://pubmed.ncbi.nlm.nih.gov/19883523/</w:t>
       </w:r>
     </w:p>
+    <w:p>
+      <w:pPr>
+        <w:pStyle w:val="Heading1"/>
+        <w:pageBreakBefore/>
+      </w:pPr>
+      <w:r>
+        <w:t>18 Continência e sono</w:t>
+      </w:r>
+    </w:p>
+    <w:p>
+      <w:r>
+        <w:t>Incluir três checkboxes independentes no bloco de condições clínicas da consulta. A product owner definiu que cada resposta positiva também indica discussão com o geriatra, independentemente dos seis domínios de rastreio.</w:t>
+      </w:r>
+    </w:p>
+    <w:tbl>
+      <w:tblPr>
+        <w:tblW w:type="auto" w:w="0"/>
+        <w:tblLayout w:type="fixed"/>
+        <w:tblLook w:firstColumn="1" w:firstRow="1" w:lastColumn="0" w:lastRow="0" w:noHBand="0" w:noVBand="1" w:val="04A0"/>
+      </w:tblPr>
+      <w:tblGrid>
+        <w:gridCol w:w="5040"/>
+        <w:gridCol w:w="5040"/>
+      </w:tblGrid>
+      <w:tr>
+        <w:tc>
+          <w:tcPr>
+            <w:tcW w:type="dxa" w:w="3024"/>
+            <w:tcBorders>
+              <w:top w:val="single" w:color="D9D9D9" w:sz="4"/>
+              <w:left w:val="single" w:color="D9D9D9" w:sz="4"/>
+              <w:bottom w:val="single" w:color="D9D9D9" w:sz="4"/>
+              <w:right w:val="single" w:color="D9D9D9" w:sz="4"/>
+            </w:tcBorders>
+            <w:shd w:fill="E7EFF2"/>
+          </w:tcPr>
+          <w:p>
+            <w:pPr>
+              <w:spacing w:before="120" w:after="120"/>
+            </w:pPr>
+            <w:r>
+              <w:rPr>
+                <w:b/>
+                <w:sz w:val="20"/>
+              </w:rPr>
+              <w:t>Checkbox</w:t>
+            </w:r>
+          </w:p>
+        </w:tc>
+        <w:tc>
+          <w:tcPr>
+            <w:tcW w:type="dxa" w:w="6336"/>
+            <w:tcBorders>
+              <w:top w:val="single" w:color="D9D9D9" w:sz="4"/>
+              <w:left w:val="single" w:color="D9D9D9" w:sz="4"/>
+              <w:bottom w:val="single" w:color="D9D9D9" w:sz="4"/>
+              <w:right w:val="single" w:color="D9D9D9" w:sz="4"/>
+            </w:tcBorders>
+            <w:shd w:fill="E7EFF2"/>
+          </w:tcPr>
+          <w:p>
+            <w:pPr>
+              <w:spacing w:before="120" w:after="120"/>
+            </w:pPr>
+            <w:r>
+              <w:rPr>
+                <w:b/>
+                <w:sz w:val="20"/>
+              </w:rPr>
+              <w:t>Pergunta de apoio</w:t>
+            </w:r>
+          </w:p>
+        </w:tc>
+      </w:tr>
+      <w:tr>
+        <w:tc>
+          <w:tcPr>
+            <w:tcW w:type="dxa" w:w="3024"/>
+            <w:tcBorders>
+              <w:top w:val="single" w:color="D9D9D9" w:sz="4"/>
+              <w:left w:val="single" w:color="D9D9D9" w:sz="4"/>
+              <w:bottom w:val="single" w:color="D9D9D9" w:sz="4"/>
+              <w:right w:val="single" w:color="D9D9D9" w:sz="4"/>
+            </w:tcBorders>
+            <w:shd w:fill="FFFFFF"/>
+          </w:tcPr>
+          <w:p>
+            <w:pPr>
+              <w:spacing w:before="120" w:after="120"/>
+            </w:pPr>
+            <w:r>
+              <w:rPr>
+                <w:b w:val="0"/>
+                <w:sz w:val="20"/>
+              </w:rPr>
+              <w:t>Incontinência urinária</w:t>
+            </w:r>
+          </w:p>
+        </w:tc>
+        <w:tc>
+          <w:tcPr>
+            <w:tcW w:type="dxa" w:w="6336"/>
+            <w:tcBorders>
+              <w:top w:val="single" w:color="D9D9D9" w:sz="4"/>
+              <w:left w:val="single" w:color="D9D9D9" w:sz="4"/>
+              <w:bottom w:val="single" w:color="D9D9D9" w:sz="4"/>
+              <w:right w:val="single" w:color="D9D9D9" w:sz="4"/>
+            </w:tcBorders>
+            <w:shd w:fill="FFFFFF"/>
+          </w:tcPr>
+          <w:p>
+            <w:pPr>
+              <w:spacing w:before="120" w:after="120"/>
+            </w:pPr>
+            <w:r>
+              <w:rPr>
+                <w:b w:val="0"/>
+                <w:sz w:val="20"/>
+              </w:rPr>
+              <w:t>Há perda involuntária de urina?</w:t>
+            </w:r>
+          </w:p>
+        </w:tc>
+      </w:tr>
+      <w:tr>
+        <w:tc>
+          <w:tcPr>
+            <w:tcW w:type="dxa" w:w="3024"/>
+            <w:tcBorders>
+              <w:top w:val="single" w:color="D9D9D9" w:sz="4"/>
+              <w:left w:val="single" w:color="D9D9D9" w:sz="4"/>
+              <w:bottom w:val="single" w:color="D9D9D9" w:sz="4"/>
+              <w:right w:val="single" w:color="D9D9D9" w:sz="4"/>
+            </w:tcBorders>
+            <w:shd w:fill="FFFFFF"/>
+          </w:tcPr>
+          <w:p>
+            <w:pPr>
+              <w:spacing w:before="120" w:after="120"/>
+            </w:pPr>
+            <w:r>
+              <w:rPr>
+                <w:b w:val="0"/>
+                <w:sz w:val="20"/>
+              </w:rPr>
+              <w:t>Incontinência fecal</w:t>
+            </w:r>
+          </w:p>
+        </w:tc>
+        <w:tc>
+          <w:tcPr>
+            <w:tcW w:type="dxa" w:w="6336"/>
+            <w:tcBorders>
+              <w:top w:val="single" w:color="D9D9D9" w:sz="4"/>
+              <w:left w:val="single" w:color="D9D9D9" w:sz="4"/>
+              <w:bottom w:val="single" w:color="D9D9D9" w:sz="4"/>
+              <w:right w:val="single" w:color="D9D9D9" w:sz="4"/>
+            </w:tcBorders>
+            <w:shd w:fill="FFFFFF"/>
+          </w:tcPr>
+          <w:p>
+            <w:pPr>
+              <w:spacing w:before="120" w:after="120"/>
+            </w:pPr>
+            <w:r>
+              <w:rPr>
+                <w:b w:val="0"/>
+                <w:sz w:val="20"/>
+              </w:rPr>
+              <w:t>Há perda involuntária de fezes?</w:t>
+            </w:r>
+          </w:p>
+        </w:tc>
+      </w:tr>
+      <w:tr>
+        <w:tc>
+          <w:tcPr>
+            <w:tcW w:type="dxa" w:w="3024"/>
+            <w:tcBorders>
+              <w:top w:val="single" w:color="D9D9D9" w:sz="4"/>
+              <w:left w:val="single" w:color="D9D9D9" w:sz="4"/>
+              <w:bottom w:val="single" w:color="D9D9D9" w:sz="4"/>
+              <w:right w:val="single" w:color="D9D9D9" w:sz="4"/>
+            </w:tcBorders>
+            <w:shd w:fill="FFFFFF"/>
+          </w:tcPr>
+          <w:p>
+            <w:pPr>
+              <w:spacing w:before="120" w:after="120"/>
+            </w:pPr>
+            <w:r>
+              <w:rPr>
+                <w:b w:val="0"/>
+                <w:sz w:val="20"/>
+              </w:rPr>
+              <w:t>Insônia</w:t>
+            </w:r>
+          </w:p>
+        </w:tc>
+        <w:tc>
+          <w:tcPr>
+            <w:tcW w:type="dxa" w:w="6336"/>
+            <w:tcBorders>
+              <w:top w:val="single" w:color="D9D9D9" w:sz="4"/>
+              <w:left w:val="single" w:color="D9D9D9" w:sz="4"/>
+              <w:bottom w:val="single" w:color="D9D9D9" w:sz="4"/>
+              <w:right w:val="single" w:color="D9D9D9" w:sz="4"/>
+            </w:tcBorders>
+            <w:shd w:fill="FFFFFF"/>
+          </w:tcPr>
+          <w:p>
+            <w:pPr>
+              <w:spacing w:before="120" w:after="120"/>
+            </w:pPr>
+            <w:r>
+              <w:rPr>
+                <w:b w:val="0"/>
+                <w:sz w:val="20"/>
+              </w:rPr>
+              <w:t>Há queixa de insônia?</w:t>
+            </w:r>
+          </w:p>
+        </w:tc>
+      </w:tr>
+    </w:tbl>
+    <w:p>
+      <w:pPr>
+        <w:pStyle w:val="Heading2"/>
+      </w:pPr>
+      <w:r>
+        <w:t>Resposta e salvamento</w:t>
+      </w:r>
+    </w:p>
+    <w:p>
+      <w:r>
+        <w:t>Usar os estados sim, não e não avaliado/informação indisponível. Checkbox marcado corresponde a sim; a ausência de marcação, por si só, não equivale a não. Disponibilizar resposta negativa explícita. Registrar informante, data e contexto opcional. Salvar por paciente e consulta; no retorno, começar sem resposta atual e mostrar o histórico separado com data.</w:t>
+      </w:r>
+    </w:p>
+    <w:p>
+      <w:pPr>
+        <w:pStyle w:val="Heading2"/>
+      </w:pPr>
+      <w:r>
+        <w:t>Informações técnicas e discussão geriátrica</w:t>
+      </w:r>
+    </w:p>
+    <w:p>
+      <w:r>
+        <w:t>Se qualquer item for positivo, mostrar o motivo e a orientação: “Discutir o caso com o geriatra do programa e definir o plano de cuidado compartilhado.” Vários itens positivos geram uma indicação com todos os motivos. Eles não alteram escores nem contam automaticamente como novos domínios para o critério de dois domínios alterados. A prioridade para avaliação geriátrica ampla mantém os critérios já definidos e a avaliação clínica.</w:t>
+      </w:r>
+    </w:p>
+    <w:p>
+      <w:r>
+        <w:t>Persistir os três estados e os motivos da indicação. Desmarcar um item deve recalcular a recomendação sem apagar o histórico de discussão ou condutas confirmadas. No relatório familiar, incluir somente achados e condutas confirmados. Nenhuma prescrição, encaminhamento ou discussão realizada será registrada automaticamente.</w:t>
+      </w:r>
+    </w:p>
+    <w:p>
+      <w:pPr>
+        <w:pStyle w:val="Heading2"/>
+      </w:pPr>
+      <w:r>
+        <w:t>Critérios de aceite adicionais</w:t>
+      </w:r>
+    </w:p>
+    <w:p>
+      <w:r>
+        <w:t>Testar cada positivo isolado com os seis domínios normais: discussão indicada. Testar combinações: uma indicação, todos os motivos. Testar três negativos explícitos com rastreio completo normal: revisão anual. Testar item não avaliado: pendência, sem assumir negativo. Confirmar que um positivo indica discussão mesmo com outras respostas ausentes; salvar e recarregar na consulta correta; retorno sem herança; remoção de um motivo preservando os demais. Confirmar que a contagem dos seis domínios e as regras das escalas permanecem intactas.</w:t>
+      </w:r>
+    </w:p>
     <w:sectPr>
       <w:footerReference w:type="default" r:id="rId9"/>
       <w:pgSz w:w="12240" w:h="15840"/>
@@ -8407,7 +8666,7 @@
       <w:rPr>
         <w:sz w:val="18"/>
       </w:rPr>
-      <w:t xml:space="preserve">Prontuário Aprimorado | Especificação 1.3 | </w:t>
+      <w:t xml:space="preserve">Prontuário Aprimorado | Especificação 1.4 | </w:t>
     </w:r>
     <w:fldSimple w:instr="PAGE"/>
   </w:p>

</xml_diff>